<commit_message>
Full documentation and cleanliness audit
- Fix a stale reference in the formal report: it still said Groq's
  default model was Qwen3-32B, which was discontinued and swapped for
  llama-3.3-70b-versatile weeks ago in the actual code.
- Add missing docstrings to base_agent.py and memory.py so the core
  execution and memory-update logic is understandable without already
  knowing the system, plus one in main.py.
- Add two real screenshots of the web UI (intake form, full result) to
  docs/screenshots/, embedded in the README.
- Remove docs/instructor_notes_raw.md and docs/INSTRUCTOR_NOTES_SUMMARY.md:
  they named the instructor and reproduced private course-channel notes
  verbatim in a public repo. Cleaned up the resulting dangling references
  in llm_client.py and the README's file tree.
</commit_message>
<xml_diff>
--- a/docs/Trendora_Capstone_Report.docx
+++ b/docs/Trendora_Capstone_Report.docx
@@ -505,7 +505,7 @@
         <w:spacing w:after="120"/>
       </w:pPr>
       <w:r>
-        <w:t xml:space="preserve">Claude (claude-sonnet-4-6) is the default model, selected for reliable adherence to a fixed, non-negotiable JSON schema across three chained agent calls — the primary technical risk in a multi-agent pipeline is schema drift compounding across steps. Each agent has its own system prompt defining its role boundary, its exact output schema, and instructions to use — not contradict — memory context. OpenAIClient and GroqClient (gpt-4o-mini and Qwen3-32B by default) are included as drop-in alternatives, selectable via the TRENDORA_PROVIDER environment variable.</w:t>
+        <w:t xml:space="preserve">Claude (claude-sonnet-4-6) is the default model, selected for reliable adherence to a fixed, non-negotiable JSON schema across three chained agent calls — the primary technical risk in a multi-agent pipeline is schema drift compounding across steps. Each agent has its own system prompt defining its role boundary, its exact output schema, and instructions to use — not contradict — memory context. OpenAIClient and GroqClient (gpt-4o-mini and Llama 3.3 70B by default) are included as drop-in alternatives, selectable via the TRENDORA_PROVIDER environment variable.</w:t>
       </w:r>
     </w:p>
     <w:p>
@@ -1259,7 +1259,7 @@
                 <w:b w:val="false"/>
                 <w:bCs w:val="false"/>
               </w:rPr>
-              <w:t xml:space="preserve">README covers architecture, inputs, model selection, outputs, enhancements, guardrail rationale, run/test instructions, time breakdown, and challenges/solutions; docs/ preserves the original assignment brief and instructor notes; this report mirrors the grading rubric section by section.</w:t>
+              <w:t xml:space="preserve">README covers architecture, inputs, model selection, outputs, enhancements, guardrail rationale, run/test instructions, time breakdown, and challenges/solutions; docs/ preserves the original assignment brief; this report mirrors the grading rubric section by section.</w:t>
             </w:r>
           </w:p>
         </w:tc>

</xml_diff>